<commit_message>
Update old folder paths in the Milestone 3 Submit document
</commit_message>
<xml_diff>
--- a/Documentation/Milestone Documentation/Milestone 3/Milestone 3 Submit.docx
+++ b/Documentation/Milestone Documentation/Milestone 3/Milestone 3 Submit.docx
@@ -4976,7 +4976,7 @@
                 <w:sz w:val="20"/>
                 <w:szCs w:val="20"/>
               </w:rPr>
-              <w:t>R/model_preparation.R</w:t>
+              <w:t>Scripts/R/model_preparation.R</w:t>
             </w:r>
           </w:p>
         </w:tc>
@@ -5732,7 +5732,7 @@
           <w:sz w:val="20"/>
           <w:szCs w:val="20"/>
         </w:rPr>
-        <w:t>R/model_preparation.R</w:t>
+        <w:t>Scripts/R/model_preparation.R</w:t>
       </w:r>
       <w:r>
         <w:t xml:space="preserve"> (</w:t>
@@ -10572,7 +10572,7 @@
           <w:sz w:val="20"/>
           <w:szCs w:val="20"/>
         </w:rPr>
-        <w:t>R/model_preparation.R</w:t>
+        <w:t>Scripts/R/model_preparation.R</w:t>
       </w:r>
       <w:r>
         <w:t>, and shared by every notebook, so no model can be trained on data prepared differently.</w:t>
@@ -10725,7 +10725,7 @@
           <w:sz w:val="20"/>
           <w:szCs w:val="20"/>
         </w:rPr>
-        <w:t>Rendered Documentation/Milestone 3/</w:t>
+        <w:t>Documentation/Rendered Documentation/</w:t>
       </w:r>
       <w:r>
         <w:t>.</w:t>
@@ -26844,7 +26844,7 @@
           <w:sz w:val="20"/>
           <w:szCs w:val="20"/>
         </w:rPr>
-        <w:t>Rendered Documentation/Milestone 3/Model Evaluation.html</w:t>
+        <w:t>Documentation/Rendered Documentation/3.3) Model Evaluation.html</w:t>
       </w:r>
       <w:r>
         <w:t>.</w:t>

</xml_diff>